<commit_message>
Improve record workflows, document generation and UI guidance
</commit_message>
<xml_diff>
--- a/doc/phieu_de_xuat.docx
+++ b/doc/phieu_de_xuat.docx
@@ -1,6 +1,6 @@
 
 <file path=word/document.xml><?xml version="1.0" encoding="utf-8"?>
-<w:document xmlns:wpc="http://schemas.microsoft.com/office/word/2010/wordprocessingCanvas" xmlns:cx="http://schemas.microsoft.com/office/drawing/2014/chartex" xmlns:cx1="http://schemas.microsoft.com/office/drawing/2015/9/8/chartex" xmlns:cx2="http://schemas.microsoft.com/office/drawing/2015/10/21/chartex" xmlns:cx3="http://schemas.microsoft.com/office/drawing/2016/5/9/chartex" xmlns:cx4="http://schemas.microsoft.com/office/drawing/2016/5/10/chartex" xmlns:cx5="http://schemas.microsoft.com/office/drawing/2016/5/11/chartex" xmlns:cx6="http://schemas.microsoft.com/office/drawing/2016/5/12/chartex" xmlns:cx7="http://schemas.microsoft.com/office/drawing/2016/5/13/chartex" xmlns:cx8="http://schemas.microsoft.com/office/drawing/2016/5/14/chartex" xmlns:mc="http://schemas.openxmlformats.org/markup-compatibility/2006" xmlns:aink="http://schemas.microsoft.com/office/drawing/2016/ink" xmlns:am3d="http://schemas.microsoft.com/office/drawing/2017/model3d" xmlns:o="urn:schemas-microsoft-com:office:office" xmlns:oel="http://schemas.microsoft.com/office/2019/extlst" xmlns:r="http://schemas.openxmlformats.org/officeDocument/2006/relationships" xmlns:m="http://schemas.openxmlformats.org/officeDocument/2006/math" xmlns:v="urn:schemas-microsoft-com:vml" xmlns:wp14="http://schemas.microsoft.com/office/word/2010/wordprocessingDrawing" xmlns:wp="http://schemas.openxmlformats.org/drawingml/2006/wordprocessingDrawing" xmlns:w10="urn:schemas-microsoft-com:office:word" xmlns:w="http://schemas.openxmlformats.org/wordprocessingml/2006/main" xmlns:w14="http://schemas.microsoft.com/office/word/2010/wordml" xmlns:w15="http://schemas.microsoft.com/office/word/2012/wordml" xmlns:w16cei="http://schemas.microsoft.com/office/word/2026/wordml/cei" xmlns:w16cex="http://schemas.microsoft.com/office/word/2018/wordml/cex" xmlns:w16cid="http://schemas.microsoft.com/office/word/2016/wordml/cid" xmlns:w16="http://schemas.microsoft.com/office/word/2018/wordml" xmlns:w16du="http://schemas.microsoft.com/office/word/2023/wordml/word16du" xmlns:w16sdtdh="http://schemas.microsoft.com/office/word/2020/wordml/sdtdatahash" xmlns:w16sdtfl="http://schemas.microsoft.com/office/word/2024/wordml/sdtformatlock" xmlns:w16se="http://schemas.microsoft.com/office/word/2015/wordml/symex" xmlns:wpg="http://schemas.microsoft.com/office/word/2010/wordprocessingGroup" xmlns:wpi="http://schemas.microsoft.com/office/word/2010/wordprocessingInk" xmlns:wne="http://schemas.microsoft.com/office/word/2006/wordml" xmlns:wps="http://schemas.microsoft.com/office/word/2010/wordprocessingShape" mc:Ignorable="w14 w15 w16se w16cid w16 w16cex w16sdtdh w16sdtfl w16du wp14">
+<w:document xmlns:wpc="http://schemas.microsoft.com/office/word/2010/wordprocessingCanvas" xmlns:cx="http://schemas.microsoft.com/office/drawing/2014/chartex" xmlns:cx1="http://schemas.microsoft.com/office/drawing/2015/9/8/chartex" xmlns:cx2="http://schemas.microsoft.com/office/drawing/2015/10/21/chartex" xmlns:cx3="http://schemas.microsoft.com/office/drawing/2016/5/9/chartex" xmlns:cx4="http://schemas.microsoft.com/office/drawing/2016/5/10/chartex" xmlns:cx5="http://schemas.microsoft.com/office/drawing/2016/5/11/chartex" xmlns:cx6="http://schemas.microsoft.com/office/drawing/2016/5/12/chartex" xmlns:cx7="http://schemas.microsoft.com/office/drawing/2016/5/13/chartex" xmlns:cx8="http://schemas.microsoft.com/office/drawing/2016/5/14/chartex" xmlns:mc="http://schemas.openxmlformats.org/markup-compatibility/2006" xmlns:aink="http://schemas.microsoft.com/office/drawing/2016/ink" xmlns:am3d="http://schemas.microsoft.com/office/drawing/2017/model3d" xmlns:o="urn:schemas-microsoft-com:office:office" xmlns:oel="http://schemas.microsoft.com/office/2019/extlst" xmlns:r="http://schemas.openxmlformats.org/officeDocument/2006/relationships" xmlns:m="http://schemas.openxmlformats.org/officeDocument/2006/math" xmlns:v="urn:schemas-microsoft-com:vml" xmlns:wp14="http://schemas.microsoft.com/office/word/2010/wordprocessingDrawing" xmlns:wp="http://schemas.openxmlformats.org/drawingml/2006/wordprocessingDrawing" xmlns:w10="urn:schemas-microsoft-com:office:word" xmlns:w="http://schemas.openxmlformats.org/wordprocessingml/2006/main" xmlns:w14="http://schemas.microsoft.com/office/word/2010/wordml" xmlns:w15="http://schemas.microsoft.com/office/word/2012/wordml" xmlns:w16cex="http://schemas.microsoft.com/office/word/2018/wordml/cex" xmlns:w16cid="http://schemas.microsoft.com/office/word/2016/wordml/cid" xmlns:w16="http://schemas.microsoft.com/office/word/2018/wordml" xmlns:w16du="http://schemas.microsoft.com/office/word/2023/wordml/word16du" xmlns:w16sdtdh="http://schemas.microsoft.com/office/word/2020/wordml/sdtdatahash" xmlns:w16sdtfl="http://schemas.microsoft.com/office/word/2024/wordml/sdtformatlock" xmlns:w16se="http://schemas.microsoft.com/office/word/2015/wordml/symex" xmlns:wpg="http://schemas.microsoft.com/office/word/2010/wordprocessingGroup" xmlns:wpi="http://schemas.microsoft.com/office/word/2010/wordprocessingInk" xmlns:wne="http://schemas.microsoft.com/office/word/2006/wordml" xmlns:wps="http://schemas.microsoft.com/office/word/2010/wordprocessingShape" mc:Ignorable="w14 w15 w16se w16cid w16 w16cex w16sdtdh w16sdtfl w16du wp14">
   <w:body>
     <w:p>
       <w:pPr>
@@ -124,17 +124,8 @@
           <w:b/>
           <w:sz w:val="26"/>
         </w:rPr>
-        <w:t xml:space="preserve"> </w:t>
-      </w:r>
-      <w:proofErr w:type="spellStart"/>
-      <w:r>
-        <w:rPr>
-          <w:b/>
-          <w:sz w:val="26"/>
-        </w:rPr>
-        <w:t>phúc</w:t>
-      </w:r>
-      <w:proofErr w:type="spellEnd"/>
+        <w:t xml:space="preserve"> phúc</w:t>
+      </w:r>
     </w:p>
     <w:p>
       <w:pPr>
@@ -492,23 +483,7 @@
           <w:sz w:val="28"/>
           <w:szCs w:val="28"/>
         </w:rPr>
-        <w:t xml:space="preserve"> </w:t>
-      </w:r>
-      <w:proofErr w:type="gramStart"/>
-      <w:r>
-        <w:rPr>
-          <w:sz w:val="28"/>
-          <w:szCs w:val="28"/>
-        </w:rPr>
-        <w:t>An</w:t>
-      </w:r>
-      <w:proofErr w:type="gramEnd"/>
-      <w:r>
-        <w:rPr>
-          <w:sz w:val="28"/>
-          <w:szCs w:val="28"/>
-        </w:rPr>
-        <w:t xml:space="preserve"> Giang</w:t>
+        <w:t xml:space="preserve"> An Giang</w:t>
       </w:r>
       <w:r>
         <w:rPr>
@@ -699,6 +674,7 @@
         <w:rPr>
           <w:sz w:val="28"/>
           <w:szCs w:val="28"/>
+          <w:highlight w:val="yellow"/>
         </w:rPr>
         <w:t>310</w:t>
       </w:r>
@@ -706,6 +682,7 @@
         <w:rPr>
           <w:sz w:val="28"/>
           <w:szCs w:val="28"/>
+          <w:highlight w:val="yellow"/>
         </w:rPr>
         <w:t>/PC-VKS-</w:t>
       </w:r>
@@ -714,6 +691,7 @@
         <w:rPr>
           <w:sz w:val="28"/>
           <w:szCs w:val="28"/>
+          <w:highlight w:val="yellow"/>
         </w:rPr>
         <w:t>TTra</w:t>
       </w:r>
@@ -874,23 +852,7 @@
           <w:sz w:val="28"/>
           <w:szCs w:val="28"/>
         </w:rPr>
-        <w:t xml:space="preserve"> </w:t>
-      </w:r>
-      <w:proofErr w:type="gramStart"/>
-      <w:r>
-        <w:rPr>
-          <w:sz w:val="28"/>
-          <w:szCs w:val="28"/>
-        </w:rPr>
-        <w:t>An</w:t>
-      </w:r>
-      <w:proofErr w:type="gramEnd"/>
-      <w:r>
-        <w:rPr>
-          <w:sz w:val="28"/>
-          <w:szCs w:val="28"/>
-        </w:rPr>
-        <w:t xml:space="preserve"> Giang</w:t>
+        <w:t xml:space="preserve"> An Giang</w:t>
       </w:r>
       <w:r>
         <w:rPr>
@@ -5352,7 +5314,7 @@
 </file>
 
 <file path=word/endnotes.xml><?xml version="1.0" encoding="utf-8"?>
-<w:endnotes xmlns:wpc="http://schemas.microsoft.com/office/word/2010/wordprocessingCanvas" xmlns:cx="http://schemas.microsoft.com/office/drawing/2014/chartex" xmlns:cx1="http://schemas.microsoft.com/office/drawing/2015/9/8/chartex" xmlns:cx2="http://schemas.microsoft.com/office/drawing/2015/10/21/chartex" xmlns:cx3="http://schemas.microsoft.com/office/drawing/2016/5/9/chartex" xmlns:cx4="http://schemas.microsoft.com/office/drawing/2016/5/10/chartex" xmlns:cx5="http://schemas.microsoft.com/office/drawing/2016/5/11/chartex" xmlns:cx6="http://schemas.microsoft.com/office/drawing/2016/5/12/chartex" xmlns:cx7="http://schemas.microsoft.com/office/drawing/2016/5/13/chartex" xmlns:cx8="http://schemas.microsoft.com/office/drawing/2016/5/14/chartex" xmlns:mc="http://schemas.openxmlformats.org/markup-compatibility/2006" xmlns:aink="http://schemas.microsoft.com/office/drawing/2016/ink" xmlns:am3d="http://schemas.microsoft.com/office/drawing/2017/model3d" xmlns:o="urn:schemas-microsoft-com:office:office" xmlns:oel="http://schemas.microsoft.com/office/2019/extlst" xmlns:r="http://schemas.openxmlformats.org/officeDocument/2006/relationships" xmlns:m="http://schemas.openxmlformats.org/officeDocument/2006/math" xmlns:v="urn:schemas-microsoft-com:vml" xmlns:wp14="http://schemas.microsoft.com/office/word/2010/wordprocessingDrawing" xmlns:wp="http://schemas.openxmlformats.org/drawingml/2006/wordprocessingDrawing" xmlns:w10="urn:schemas-microsoft-com:office:word" xmlns:w="http://schemas.openxmlformats.org/wordprocessingml/2006/main" xmlns:w14="http://schemas.microsoft.com/office/word/2010/wordml" xmlns:w15="http://schemas.microsoft.com/office/word/2012/wordml" xmlns:w16cei="http://schemas.microsoft.com/office/word/2026/wordml/cei" xmlns:w16cex="http://schemas.microsoft.com/office/word/2018/wordml/cex" xmlns:w16cid="http://schemas.microsoft.com/office/word/2016/wordml/cid" xmlns:w16="http://schemas.microsoft.com/office/word/2018/wordml" xmlns:w16du="http://schemas.microsoft.com/office/word/2023/wordml/word16du" xmlns:w16sdtdh="http://schemas.microsoft.com/office/word/2020/wordml/sdtdatahash" xmlns:w16sdtfl="http://schemas.microsoft.com/office/word/2024/wordml/sdtformatlock" xmlns:w16se="http://schemas.microsoft.com/office/word/2015/wordml/symex" xmlns:wpg="http://schemas.microsoft.com/office/word/2010/wordprocessingGroup" xmlns:wpi="http://schemas.microsoft.com/office/word/2010/wordprocessingInk" xmlns:wne="http://schemas.microsoft.com/office/word/2006/wordml" xmlns:wps="http://schemas.microsoft.com/office/word/2010/wordprocessingShape" mc:Ignorable="w14 w15 w16se w16cid w16 w16cex w16sdtdh w16sdtfl w16du wp14">
+<w:endnotes xmlns:wpc="http://schemas.microsoft.com/office/word/2010/wordprocessingCanvas" xmlns:cx="http://schemas.microsoft.com/office/drawing/2014/chartex" xmlns:cx1="http://schemas.microsoft.com/office/drawing/2015/9/8/chartex" xmlns:cx2="http://schemas.microsoft.com/office/drawing/2015/10/21/chartex" xmlns:cx3="http://schemas.microsoft.com/office/drawing/2016/5/9/chartex" xmlns:cx4="http://schemas.microsoft.com/office/drawing/2016/5/10/chartex" xmlns:cx5="http://schemas.microsoft.com/office/drawing/2016/5/11/chartex" xmlns:cx6="http://schemas.microsoft.com/office/drawing/2016/5/12/chartex" xmlns:cx7="http://schemas.microsoft.com/office/drawing/2016/5/13/chartex" xmlns:cx8="http://schemas.microsoft.com/office/drawing/2016/5/14/chartex" xmlns:mc="http://schemas.openxmlformats.org/markup-compatibility/2006" xmlns:aink="http://schemas.microsoft.com/office/drawing/2016/ink" xmlns:am3d="http://schemas.microsoft.com/office/drawing/2017/model3d" xmlns:o="urn:schemas-microsoft-com:office:office" xmlns:oel="http://schemas.microsoft.com/office/2019/extlst" xmlns:r="http://schemas.openxmlformats.org/officeDocument/2006/relationships" xmlns:m="http://schemas.openxmlformats.org/officeDocument/2006/math" xmlns:v="urn:schemas-microsoft-com:vml" xmlns:wp14="http://schemas.microsoft.com/office/word/2010/wordprocessingDrawing" xmlns:wp="http://schemas.openxmlformats.org/drawingml/2006/wordprocessingDrawing" xmlns:w10="urn:schemas-microsoft-com:office:word" xmlns:w="http://schemas.openxmlformats.org/wordprocessingml/2006/main" xmlns:w14="http://schemas.microsoft.com/office/word/2010/wordml" xmlns:w15="http://schemas.microsoft.com/office/word/2012/wordml" xmlns:w16cex="http://schemas.microsoft.com/office/word/2018/wordml/cex" xmlns:w16cid="http://schemas.microsoft.com/office/word/2016/wordml/cid" xmlns:w16="http://schemas.microsoft.com/office/word/2018/wordml" xmlns:w16du="http://schemas.microsoft.com/office/word/2023/wordml/word16du" xmlns:w16sdtdh="http://schemas.microsoft.com/office/word/2020/wordml/sdtdatahash" xmlns:w16sdtfl="http://schemas.microsoft.com/office/word/2024/wordml/sdtformatlock" xmlns:w16se="http://schemas.microsoft.com/office/word/2015/wordml/symex" xmlns:wpg="http://schemas.microsoft.com/office/word/2010/wordprocessingGroup" xmlns:wpi="http://schemas.microsoft.com/office/word/2010/wordprocessingInk" xmlns:wne="http://schemas.microsoft.com/office/word/2006/wordml" xmlns:wps="http://schemas.microsoft.com/office/word/2010/wordprocessingShape" mc:Ignorable="w14 w15 w16se w16cid w16 w16cex w16sdtdh w16sdtfl w16du wp14">
   <w:endnote w:type="separator" w:id="-1">
     <w:p>
       <w:r>
@@ -5371,7 +5333,7 @@
 </file>
 
 <file path=word/footnotes.xml><?xml version="1.0" encoding="utf-8"?>
-<w:footnotes xmlns:wpc="http://schemas.microsoft.com/office/word/2010/wordprocessingCanvas" xmlns:cx="http://schemas.microsoft.com/office/drawing/2014/chartex" xmlns:cx1="http://schemas.microsoft.com/office/drawing/2015/9/8/chartex" xmlns:cx2="http://schemas.microsoft.com/office/drawing/2015/10/21/chartex" xmlns:cx3="http://schemas.microsoft.com/office/drawing/2016/5/9/chartex" xmlns:cx4="http://schemas.microsoft.com/office/drawing/2016/5/10/chartex" xmlns:cx5="http://schemas.microsoft.com/office/drawing/2016/5/11/chartex" xmlns:cx6="http://schemas.microsoft.com/office/drawing/2016/5/12/chartex" xmlns:cx7="http://schemas.microsoft.com/office/drawing/2016/5/13/chartex" xmlns:cx8="http://schemas.microsoft.com/office/drawing/2016/5/14/chartex" xmlns:mc="http://schemas.openxmlformats.org/markup-compatibility/2006" xmlns:aink="http://schemas.microsoft.com/office/drawing/2016/ink" xmlns:am3d="http://schemas.microsoft.com/office/drawing/2017/model3d" xmlns:o="urn:schemas-microsoft-com:office:office" xmlns:oel="http://schemas.microsoft.com/office/2019/extlst" xmlns:r="http://schemas.openxmlformats.org/officeDocument/2006/relationships" xmlns:m="http://schemas.openxmlformats.org/officeDocument/2006/math" xmlns:v="urn:schemas-microsoft-com:vml" xmlns:wp14="http://schemas.microsoft.com/office/word/2010/wordprocessingDrawing" xmlns:wp="http://schemas.openxmlformats.org/drawingml/2006/wordprocessingDrawing" xmlns:w10="urn:schemas-microsoft-com:office:word" xmlns:w="http://schemas.openxmlformats.org/wordprocessingml/2006/main" xmlns:w14="http://schemas.microsoft.com/office/word/2010/wordml" xmlns:w15="http://schemas.microsoft.com/office/word/2012/wordml" xmlns:w16cei="http://schemas.microsoft.com/office/word/2026/wordml/cei" xmlns:w16cex="http://schemas.microsoft.com/office/word/2018/wordml/cex" xmlns:w16cid="http://schemas.microsoft.com/office/word/2016/wordml/cid" xmlns:w16="http://schemas.microsoft.com/office/word/2018/wordml" xmlns:w16du="http://schemas.microsoft.com/office/word/2023/wordml/word16du" xmlns:w16sdtdh="http://schemas.microsoft.com/office/word/2020/wordml/sdtdatahash" xmlns:w16sdtfl="http://schemas.microsoft.com/office/word/2024/wordml/sdtformatlock" xmlns:w16se="http://schemas.microsoft.com/office/word/2015/wordml/symex" xmlns:wpg="http://schemas.microsoft.com/office/word/2010/wordprocessingGroup" xmlns:wpi="http://schemas.microsoft.com/office/word/2010/wordprocessingInk" xmlns:wne="http://schemas.microsoft.com/office/word/2006/wordml" xmlns:wps="http://schemas.microsoft.com/office/word/2010/wordprocessingShape" mc:Ignorable="w14 w15 w16se w16cid w16 w16cex w16sdtdh w16sdtfl w16du wp14">
+<w:footnotes xmlns:wpc="http://schemas.microsoft.com/office/word/2010/wordprocessingCanvas" xmlns:cx="http://schemas.microsoft.com/office/drawing/2014/chartex" xmlns:cx1="http://schemas.microsoft.com/office/drawing/2015/9/8/chartex" xmlns:cx2="http://schemas.microsoft.com/office/drawing/2015/10/21/chartex" xmlns:cx3="http://schemas.microsoft.com/office/drawing/2016/5/9/chartex" xmlns:cx4="http://schemas.microsoft.com/office/drawing/2016/5/10/chartex" xmlns:cx5="http://schemas.microsoft.com/office/drawing/2016/5/11/chartex" xmlns:cx6="http://schemas.microsoft.com/office/drawing/2016/5/12/chartex" xmlns:cx7="http://schemas.microsoft.com/office/drawing/2016/5/13/chartex" xmlns:cx8="http://schemas.microsoft.com/office/drawing/2016/5/14/chartex" xmlns:mc="http://schemas.openxmlformats.org/markup-compatibility/2006" xmlns:aink="http://schemas.microsoft.com/office/drawing/2016/ink" xmlns:am3d="http://schemas.microsoft.com/office/drawing/2017/model3d" xmlns:o="urn:schemas-microsoft-com:office:office" xmlns:oel="http://schemas.microsoft.com/office/2019/extlst" xmlns:r="http://schemas.openxmlformats.org/officeDocument/2006/relationships" xmlns:m="http://schemas.openxmlformats.org/officeDocument/2006/math" xmlns:v="urn:schemas-microsoft-com:vml" xmlns:wp14="http://schemas.microsoft.com/office/word/2010/wordprocessingDrawing" xmlns:wp="http://schemas.openxmlformats.org/drawingml/2006/wordprocessingDrawing" xmlns:w10="urn:schemas-microsoft-com:office:word" xmlns:w="http://schemas.openxmlformats.org/wordprocessingml/2006/main" xmlns:w14="http://schemas.microsoft.com/office/word/2010/wordml" xmlns:w15="http://schemas.microsoft.com/office/word/2012/wordml" xmlns:w16cex="http://schemas.microsoft.com/office/word/2018/wordml/cex" xmlns:w16cid="http://schemas.microsoft.com/office/word/2016/wordml/cid" xmlns:w16="http://schemas.microsoft.com/office/word/2018/wordml" xmlns:w16du="http://schemas.microsoft.com/office/word/2023/wordml/word16du" xmlns:w16sdtdh="http://schemas.microsoft.com/office/word/2020/wordml/sdtdatahash" xmlns:w16sdtfl="http://schemas.microsoft.com/office/word/2024/wordml/sdtformatlock" xmlns:w16se="http://schemas.microsoft.com/office/word/2015/wordml/symex" xmlns:wpg="http://schemas.microsoft.com/office/word/2010/wordprocessingGroup" xmlns:wpi="http://schemas.microsoft.com/office/word/2010/wordprocessingInk" xmlns:wne="http://schemas.microsoft.com/office/word/2006/wordml" xmlns:wps="http://schemas.microsoft.com/office/word/2010/wordprocessingShape" mc:Ignorable="w14 w15 w16se w16cid w16 w16cex w16sdtdh w16sdtfl w16du wp14">
   <w:footnote w:type="separator" w:id="-1">
     <w:p>
       <w:r>
@@ -5390,7 +5352,7 @@
 </file>
 
 <file path=word/header1.xml><?xml version="1.0" encoding="utf-8"?>
-<w:hdr xmlns:wpc="http://schemas.microsoft.com/office/word/2010/wordprocessingCanvas" xmlns:cx="http://schemas.microsoft.com/office/drawing/2014/chartex" xmlns:cx1="http://schemas.microsoft.com/office/drawing/2015/9/8/chartex" xmlns:cx2="http://schemas.microsoft.com/office/drawing/2015/10/21/chartex" xmlns:cx3="http://schemas.microsoft.com/office/drawing/2016/5/9/chartex" xmlns:cx4="http://schemas.microsoft.com/office/drawing/2016/5/10/chartex" xmlns:cx5="http://schemas.microsoft.com/office/drawing/2016/5/11/chartex" xmlns:cx6="http://schemas.microsoft.com/office/drawing/2016/5/12/chartex" xmlns:cx7="http://schemas.microsoft.com/office/drawing/2016/5/13/chartex" xmlns:cx8="http://schemas.microsoft.com/office/drawing/2016/5/14/chartex" xmlns:mc="http://schemas.openxmlformats.org/markup-compatibility/2006" xmlns:aink="http://schemas.microsoft.com/office/drawing/2016/ink" xmlns:am3d="http://schemas.microsoft.com/office/drawing/2017/model3d" xmlns:o="urn:schemas-microsoft-com:office:office" xmlns:oel="http://schemas.microsoft.com/office/2019/extlst" xmlns:r="http://schemas.openxmlformats.org/officeDocument/2006/relationships" xmlns:m="http://schemas.openxmlformats.org/officeDocument/2006/math" xmlns:v="urn:schemas-microsoft-com:vml" xmlns:wp14="http://schemas.microsoft.com/office/word/2010/wordprocessingDrawing" xmlns:wp="http://schemas.openxmlformats.org/drawingml/2006/wordprocessingDrawing" xmlns:w10="urn:schemas-microsoft-com:office:word" xmlns:w="http://schemas.openxmlformats.org/wordprocessingml/2006/main" xmlns:w14="http://schemas.microsoft.com/office/word/2010/wordml" xmlns:w15="http://schemas.microsoft.com/office/word/2012/wordml" xmlns:w16cei="http://schemas.microsoft.com/office/word/2026/wordml/cei" xmlns:w16cex="http://schemas.microsoft.com/office/word/2018/wordml/cex" xmlns:w16cid="http://schemas.microsoft.com/office/word/2016/wordml/cid" xmlns:w16="http://schemas.microsoft.com/office/word/2018/wordml" xmlns:w16du="http://schemas.microsoft.com/office/word/2023/wordml/word16du" xmlns:w16sdtdh="http://schemas.microsoft.com/office/word/2020/wordml/sdtdatahash" xmlns:w16sdtfl="http://schemas.microsoft.com/office/word/2024/wordml/sdtformatlock" xmlns:w16se="http://schemas.microsoft.com/office/word/2015/wordml/symex" xmlns:wpg="http://schemas.microsoft.com/office/word/2010/wordprocessingGroup" xmlns:wpi="http://schemas.microsoft.com/office/word/2010/wordprocessingInk" xmlns:wne="http://schemas.microsoft.com/office/word/2006/wordml" xmlns:wps="http://schemas.microsoft.com/office/word/2010/wordprocessingShape" mc:Ignorable="w14 w15 w16se w16cid w16 w16cex w16sdtdh w16sdtfl w16du wp14">
+<w:hdr xmlns:wpc="http://schemas.microsoft.com/office/word/2010/wordprocessingCanvas" xmlns:cx="http://schemas.microsoft.com/office/drawing/2014/chartex" xmlns:cx1="http://schemas.microsoft.com/office/drawing/2015/9/8/chartex" xmlns:cx2="http://schemas.microsoft.com/office/drawing/2015/10/21/chartex" xmlns:cx3="http://schemas.microsoft.com/office/drawing/2016/5/9/chartex" xmlns:cx4="http://schemas.microsoft.com/office/drawing/2016/5/10/chartex" xmlns:cx5="http://schemas.microsoft.com/office/drawing/2016/5/11/chartex" xmlns:cx6="http://schemas.microsoft.com/office/drawing/2016/5/12/chartex" xmlns:cx7="http://schemas.microsoft.com/office/drawing/2016/5/13/chartex" xmlns:cx8="http://schemas.microsoft.com/office/drawing/2016/5/14/chartex" xmlns:mc="http://schemas.openxmlformats.org/markup-compatibility/2006" xmlns:aink="http://schemas.microsoft.com/office/drawing/2016/ink" xmlns:am3d="http://schemas.microsoft.com/office/drawing/2017/model3d" xmlns:o="urn:schemas-microsoft-com:office:office" xmlns:oel="http://schemas.microsoft.com/office/2019/extlst" xmlns:r="http://schemas.openxmlformats.org/officeDocument/2006/relationships" xmlns:m="http://schemas.openxmlformats.org/officeDocument/2006/math" xmlns:v="urn:schemas-microsoft-com:vml" xmlns:wp14="http://schemas.microsoft.com/office/word/2010/wordprocessingDrawing" xmlns:wp="http://schemas.openxmlformats.org/drawingml/2006/wordprocessingDrawing" xmlns:w10="urn:schemas-microsoft-com:office:word" xmlns:w="http://schemas.openxmlformats.org/wordprocessingml/2006/main" xmlns:w14="http://schemas.microsoft.com/office/word/2010/wordml" xmlns:w15="http://schemas.microsoft.com/office/word/2012/wordml" xmlns:w16cex="http://schemas.microsoft.com/office/word/2018/wordml/cex" xmlns:w16cid="http://schemas.microsoft.com/office/word/2016/wordml/cid" xmlns:w16="http://schemas.microsoft.com/office/word/2018/wordml" xmlns:w16du="http://schemas.microsoft.com/office/word/2023/wordml/word16du" xmlns:w16sdtdh="http://schemas.microsoft.com/office/word/2020/wordml/sdtdatahash" xmlns:w16sdtfl="http://schemas.microsoft.com/office/word/2024/wordml/sdtformatlock" xmlns:w16se="http://schemas.microsoft.com/office/word/2015/wordml/symex" xmlns:wpg="http://schemas.microsoft.com/office/word/2010/wordprocessingGroup" xmlns:wpi="http://schemas.microsoft.com/office/word/2010/wordprocessingInk" xmlns:wne="http://schemas.microsoft.com/office/word/2006/wordml" xmlns:wps="http://schemas.microsoft.com/office/word/2010/wordprocessingShape" mc:Ignorable="w14 w15 w16se w16cid w16 w16cex w16sdtdh w16sdtfl w16du wp14">
   <w:p>
     <w:pPr>
       <w:pStyle w:val="Header"/>
@@ -5427,7 +5389,7 @@
 </file>
 
 <file path=word/numbering.xml><?xml version="1.0" encoding="utf-8"?>
-<w:numbering xmlns:wpc="http://schemas.microsoft.com/office/word/2010/wordprocessingCanvas" xmlns:cx="http://schemas.microsoft.com/office/drawing/2014/chartex" xmlns:cx1="http://schemas.microsoft.com/office/drawing/2015/9/8/chartex" xmlns:cx2="http://schemas.microsoft.com/office/drawing/2015/10/21/chartex" xmlns:cx3="http://schemas.microsoft.com/office/drawing/2016/5/9/chartex" xmlns:cx4="http://schemas.microsoft.com/office/drawing/2016/5/10/chartex" xmlns:cx5="http://schemas.microsoft.com/office/drawing/2016/5/11/chartex" xmlns:cx6="http://schemas.microsoft.com/office/drawing/2016/5/12/chartex" xmlns:cx7="http://schemas.microsoft.com/office/drawing/2016/5/13/chartex" xmlns:cx8="http://schemas.microsoft.com/office/drawing/2016/5/14/chartex" xmlns:mc="http://schemas.openxmlformats.org/markup-compatibility/2006" xmlns:aink="http://schemas.microsoft.com/office/drawing/2016/ink" xmlns:am3d="http://schemas.microsoft.com/office/drawing/2017/model3d" xmlns:o="urn:schemas-microsoft-com:office:office" xmlns:oel="http://schemas.microsoft.com/office/2019/extlst" xmlns:r="http://schemas.openxmlformats.org/officeDocument/2006/relationships" xmlns:m="http://schemas.openxmlformats.org/officeDocument/2006/math" xmlns:v="urn:schemas-microsoft-com:vml" xmlns:wp14="http://schemas.microsoft.com/office/word/2010/wordprocessingDrawing" xmlns:wp="http://schemas.openxmlformats.org/drawingml/2006/wordprocessingDrawing" xmlns:w10="urn:schemas-microsoft-com:office:word" xmlns:w="http://schemas.openxmlformats.org/wordprocessingml/2006/main" xmlns:w14="http://schemas.microsoft.com/office/word/2010/wordml" xmlns:w15="http://schemas.microsoft.com/office/word/2012/wordml" xmlns:w16cei="http://schemas.microsoft.com/office/word/2026/wordml/cei" xmlns:w16cex="http://schemas.microsoft.com/office/word/2018/wordml/cex" xmlns:w16cid="http://schemas.microsoft.com/office/word/2016/wordml/cid" xmlns:w16="http://schemas.microsoft.com/office/word/2018/wordml" xmlns:w16du="http://schemas.microsoft.com/office/word/2023/wordml/word16du" xmlns:w16sdtdh="http://schemas.microsoft.com/office/word/2020/wordml/sdtdatahash" xmlns:w16sdtfl="http://schemas.microsoft.com/office/word/2024/wordml/sdtformatlock" xmlns:w16se="http://schemas.microsoft.com/office/word/2015/wordml/symex" xmlns:wpg="http://schemas.microsoft.com/office/word/2010/wordprocessingGroup" xmlns:wpi="http://schemas.microsoft.com/office/word/2010/wordprocessingInk" xmlns:wne="http://schemas.microsoft.com/office/word/2006/wordml" xmlns:wps="http://schemas.microsoft.com/office/word/2010/wordprocessingShape" mc:Ignorable="w14 w15 w16se w16cid w16 w16cex w16sdtdh w16sdtfl w16du wp14">
+<w:numbering xmlns:wpc="http://schemas.microsoft.com/office/word/2010/wordprocessingCanvas" xmlns:cx="http://schemas.microsoft.com/office/drawing/2014/chartex" xmlns:cx1="http://schemas.microsoft.com/office/drawing/2015/9/8/chartex" xmlns:cx2="http://schemas.microsoft.com/office/drawing/2015/10/21/chartex" xmlns:cx3="http://schemas.microsoft.com/office/drawing/2016/5/9/chartex" xmlns:cx4="http://schemas.microsoft.com/office/drawing/2016/5/10/chartex" xmlns:cx5="http://schemas.microsoft.com/office/drawing/2016/5/11/chartex" xmlns:cx6="http://schemas.microsoft.com/office/drawing/2016/5/12/chartex" xmlns:cx7="http://schemas.microsoft.com/office/drawing/2016/5/13/chartex" xmlns:cx8="http://schemas.microsoft.com/office/drawing/2016/5/14/chartex" xmlns:mc="http://schemas.openxmlformats.org/markup-compatibility/2006" xmlns:aink="http://schemas.microsoft.com/office/drawing/2016/ink" xmlns:am3d="http://schemas.microsoft.com/office/drawing/2017/model3d" xmlns:o="urn:schemas-microsoft-com:office:office" xmlns:oel="http://schemas.microsoft.com/office/2019/extlst" xmlns:r="http://schemas.openxmlformats.org/officeDocument/2006/relationships" xmlns:m="http://schemas.openxmlformats.org/officeDocument/2006/math" xmlns:v="urn:schemas-microsoft-com:vml" xmlns:wp14="http://schemas.microsoft.com/office/word/2010/wordprocessingDrawing" xmlns:wp="http://schemas.openxmlformats.org/drawingml/2006/wordprocessingDrawing" xmlns:w10="urn:schemas-microsoft-com:office:word" xmlns:w="http://schemas.openxmlformats.org/wordprocessingml/2006/main" xmlns:w14="http://schemas.microsoft.com/office/word/2010/wordml" xmlns:w15="http://schemas.microsoft.com/office/word/2012/wordml" xmlns:w16cex="http://schemas.microsoft.com/office/word/2018/wordml/cex" xmlns:w16cid="http://schemas.microsoft.com/office/word/2016/wordml/cid" xmlns:w16="http://schemas.microsoft.com/office/word/2018/wordml" xmlns:w16du="http://schemas.microsoft.com/office/word/2023/wordml/word16du" xmlns:w16sdtdh="http://schemas.microsoft.com/office/word/2020/wordml/sdtdatahash" xmlns:w16sdtfl="http://schemas.microsoft.com/office/word/2024/wordml/sdtformatlock" xmlns:w16se="http://schemas.microsoft.com/office/word/2015/wordml/symex" xmlns:wpg="http://schemas.microsoft.com/office/word/2010/wordprocessingGroup" xmlns:wpi="http://schemas.microsoft.com/office/word/2010/wordprocessingInk" xmlns:wne="http://schemas.microsoft.com/office/word/2006/wordml" xmlns:wps="http://schemas.microsoft.com/office/word/2010/wordprocessingShape" mc:Ignorable="w14 w15 w16se w16cid w16 w16cex w16sdtdh w16sdtfl w16du wp14">
   <w:abstractNum w:abstractNumId="0" w15:restartNumberingAfterBreak="0">
     <w:nsid w:val="191B605E"/>
     <w:multiLevelType w:val="hybridMultilevel"/>
@@ -5809,6 +5771,50 @@
     <w:lsdException w:name="Subtitle" w:qFormat="1"/>
     <w:lsdException w:name="Strong" w:qFormat="1"/>
     <w:lsdException w:name="Emphasis" w:qFormat="1"/>
+    <w:lsdException w:name="Normal Table" w:semiHidden="1" w:unhideWhenUsed="1"/>
+    <w:lsdException w:name="Table Simple 1" w:semiHidden="1" w:unhideWhenUsed="1"/>
+    <w:lsdException w:name="Table Simple 2" w:semiHidden="1" w:unhideWhenUsed="1"/>
+    <w:lsdException w:name="Table Simple 3" w:semiHidden="1" w:unhideWhenUsed="1"/>
+    <w:lsdException w:name="Table Classic 1" w:semiHidden="1" w:unhideWhenUsed="1"/>
+    <w:lsdException w:name="Table Classic 2" w:semiHidden="1" w:unhideWhenUsed="1"/>
+    <w:lsdException w:name="Table Classic 3" w:semiHidden="1" w:unhideWhenUsed="1"/>
+    <w:lsdException w:name="Table Classic 4" w:semiHidden="1" w:unhideWhenUsed="1"/>
+    <w:lsdException w:name="Table Colorful 1" w:semiHidden="1" w:unhideWhenUsed="1"/>
+    <w:lsdException w:name="Table Colorful 2" w:semiHidden="1" w:unhideWhenUsed="1"/>
+    <w:lsdException w:name="Table Colorful 3" w:semiHidden="1" w:unhideWhenUsed="1"/>
+    <w:lsdException w:name="Table Columns 1" w:semiHidden="1" w:unhideWhenUsed="1"/>
+    <w:lsdException w:name="Table Columns 2" w:semiHidden="1" w:unhideWhenUsed="1"/>
+    <w:lsdException w:name="Table Columns 3" w:semiHidden="1" w:unhideWhenUsed="1"/>
+    <w:lsdException w:name="Table Columns 4" w:semiHidden="1" w:unhideWhenUsed="1"/>
+    <w:lsdException w:name="Table Columns 5" w:semiHidden="1" w:unhideWhenUsed="1"/>
+    <w:lsdException w:name="Table Grid 1" w:semiHidden="1" w:unhideWhenUsed="1"/>
+    <w:lsdException w:name="Table Grid 2" w:semiHidden="1" w:unhideWhenUsed="1"/>
+    <w:lsdException w:name="Table Grid 3" w:semiHidden="1" w:unhideWhenUsed="1"/>
+    <w:lsdException w:name="Table Grid 4" w:semiHidden="1" w:unhideWhenUsed="1"/>
+    <w:lsdException w:name="Table Grid 5" w:semiHidden="1" w:unhideWhenUsed="1"/>
+    <w:lsdException w:name="Table Grid 6" w:semiHidden="1" w:unhideWhenUsed="1"/>
+    <w:lsdException w:name="Table Grid 7" w:semiHidden="1" w:unhideWhenUsed="1"/>
+    <w:lsdException w:name="Table Grid 8" w:semiHidden="1" w:unhideWhenUsed="1"/>
+    <w:lsdException w:name="Table List 1" w:semiHidden="1" w:unhideWhenUsed="1"/>
+    <w:lsdException w:name="Table List 2" w:semiHidden="1" w:unhideWhenUsed="1"/>
+    <w:lsdException w:name="Table List 3" w:semiHidden="1" w:unhideWhenUsed="1"/>
+    <w:lsdException w:name="Table List 4" w:semiHidden="1" w:unhideWhenUsed="1"/>
+    <w:lsdException w:name="Table List 5" w:semiHidden="1" w:unhideWhenUsed="1"/>
+    <w:lsdException w:name="Table List 6" w:semiHidden="1" w:unhideWhenUsed="1"/>
+    <w:lsdException w:name="Table List 7" w:semiHidden="1" w:unhideWhenUsed="1"/>
+    <w:lsdException w:name="Table List 8" w:semiHidden="1" w:unhideWhenUsed="1"/>
+    <w:lsdException w:name="Table 3D effects 1" w:semiHidden="1" w:unhideWhenUsed="1"/>
+    <w:lsdException w:name="Table 3D effects 2" w:semiHidden="1" w:unhideWhenUsed="1"/>
+    <w:lsdException w:name="Table 3D effects 3" w:semiHidden="1" w:unhideWhenUsed="1"/>
+    <w:lsdException w:name="Table Contemporary" w:semiHidden="1" w:unhideWhenUsed="1"/>
+    <w:lsdException w:name="Table Elegant" w:semiHidden="1" w:unhideWhenUsed="1"/>
+    <w:lsdException w:name="Table Professional" w:semiHidden="1" w:unhideWhenUsed="1"/>
+    <w:lsdException w:name="Table Subtle 1" w:semiHidden="1" w:unhideWhenUsed="1"/>
+    <w:lsdException w:name="Table Subtle 2" w:semiHidden="1" w:unhideWhenUsed="1"/>
+    <w:lsdException w:name="Table Web 1" w:semiHidden="1" w:unhideWhenUsed="1"/>
+    <w:lsdException w:name="Table Web 2" w:semiHidden="1" w:unhideWhenUsed="1"/>
+    <w:lsdException w:name="Table Web 3" w:semiHidden="1" w:unhideWhenUsed="1"/>
+    <w:lsdException w:name="Table Theme" w:semiHidden="1" w:unhideWhenUsed="1"/>
     <w:lsdException w:name="Placeholder Text" w:semiHidden="1" w:uiPriority="99"/>
     <w:lsdException w:name="No Spacing" w:uiPriority="1" w:qFormat="1"/>
     <w:lsdException w:name="Light Shading" w:uiPriority="60"/>
@@ -6040,11 +6046,15 @@
   </w:style>
   <w:style w:type="character" w:default="1" w:styleId="DefaultParagraphFont">
     <w:name w:val="Default Paragraph Font"/>
+    <w:uiPriority w:val="1"/>
     <w:semiHidden/>
+    <w:unhideWhenUsed/>
   </w:style>
   <w:style w:type="table" w:default="1" w:styleId="TableNormal">
     <w:name w:val="Normal Table"/>
+    <w:uiPriority w:val="99"/>
     <w:semiHidden/>
+    <w:unhideWhenUsed/>
     <w:tblPr>
       <w:tblInd w:w="0" w:type="dxa"/>
       <w:tblCellMar>
@@ -6057,7 +6067,9 @@
   </w:style>
   <w:style w:type="numbering" w:default="1" w:styleId="NoList">
     <w:name w:val="No List"/>
+    <w:uiPriority w:val="99"/>
     <w:semiHidden/>
+    <w:unhideWhenUsed/>
   </w:style>
   <w:style w:type="paragraph" w:styleId="BalloonText">
     <w:name w:val="Balloon Text"/>

</xml_diff>